<commit_message>
docs: update D2.2 technical report
</commit_message>
<xml_diff>
--- a/Documents/BENEFITS_D2.2_Microsimulation_Tech_Report.docx
+++ b/Documents/BENEFITS_D2.2_Microsimulation_Tech_Report.docx
@@ -612,8 +612,8 @@
         <w:tblLook w:val="04A0" w:firstRow="1" w:lastRow="0" w:firstColumn="1" w:lastColumn="0" w:noHBand="0" w:noVBand="1"/>
       </w:tblPr>
       <w:tblGrid>
-        <w:gridCol w:w="2921"/>
-        <w:gridCol w:w="6095"/>
+        <w:gridCol w:w="2919"/>
+        <w:gridCol w:w="6097"/>
       </w:tblGrid>
       <w:tr>
         <w:trPr>
@@ -622,6 +622,12 @@
         <w:tc>
           <w:tcPr>
             <w:tcW w:w="2972" w:type="dxa"/>
+            <w:tcBorders>
+              <w:top w:val="single" w:sz="4" w:space="0" w:color="auto"/>
+              <w:left w:val="single" w:sz="4" w:space="0" w:color="auto"/>
+              <w:bottom w:val="single" w:sz="4" w:space="0" w:color="auto"/>
+              <w:right w:val="single" w:sz="4" w:space="0" w:color="auto"/>
+            </w:tcBorders>
             <w:shd w:val="clear" w:color="auto" w:fill="181749"/>
             <w:vAlign w:val="center"/>
           </w:tcPr>
@@ -630,18 +636,14 @@
               <w:spacing w:before="40" w:after="40"/>
               <w:rPr>
                 <w:rFonts w:cs="Open Sans"/>
-                <w:b/>
-                <w:bCs/>
-                <w:color w:val="000000" w:themeColor="text1"/>
+                <w:color w:val="FFFFFF" w:themeColor="background1"/>
                 <w:szCs w:val="20"/>
               </w:rPr>
             </w:pPr>
             <w:r>
               <w:rPr>
                 <w:rFonts w:cs="Open Sans"/>
-                <w:b/>
-                <w:bCs/>
-                <w:color w:val="000000" w:themeColor="text1"/>
+                <w:color w:val="FFFFFF" w:themeColor="background1"/>
                 <w:szCs w:val="20"/>
               </w:rPr>
               <w:t>Project Acronym</w:t>
@@ -651,6 +653,9 @@
         <w:tc>
           <w:tcPr>
             <w:tcW w:w="6237" w:type="dxa"/>
+            <w:tcBorders>
+              <w:left w:val="single" w:sz="4" w:space="0" w:color="auto"/>
+            </w:tcBorders>
             <w:vAlign w:val="center"/>
           </w:tcPr>
           <w:p>
@@ -681,6 +686,12 @@
         <w:tc>
           <w:tcPr>
             <w:tcW w:w="2972" w:type="dxa"/>
+            <w:tcBorders>
+              <w:top w:val="single" w:sz="4" w:space="0" w:color="auto"/>
+              <w:left w:val="single" w:sz="4" w:space="0" w:color="auto"/>
+              <w:bottom w:val="single" w:sz="4" w:space="0" w:color="auto"/>
+              <w:right w:val="single" w:sz="4" w:space="0" w:color="auto"/>
+            </w:tcBorders>
             <w:shd w:val="clear" w:color="auto" w:fill="181749"/>
             <w:vAlign w:val="center"/>
           </w:tcPr>
@@ -689,18 +700,14 @@
               <w:spacing w:before="40" w:after="40"/>
               <w:rPr>
                 <w:rFonts w:cs="Open Sans"/>
-                <w:b/>
-                <w:bCs/>
-                <w:color w:val="000000" w:themeColor="text1"/>
+                <w:color w:val="FFFFFF" w:themeColor="background1"/>
                 <w:szCs w:val="20"/>
               </w:rPr>
             </w:pPr>
             <w:r>
               <w:rPr>
                 <w:rFonts w:cs="Open Sans"/>
-                <w:b/>
-                <w:bCs/>
-                <w:color w:val="000000" w:themeColor="text1"/>
+                <w:color w:val="FFFFFF" w:themeColor="background1"/>
                 <w:szCs w:val="20"/>
               </w:rPr>
               <w:t>Project Name</w:t>
@@ -710,6 +717,9 @@
         <w:tc>
           <w:tcPr>
             <w:tcW w:w="6237" w:type="dxa"/>
+            <w:tcBorders>
+              <w:left w:val="single" w:sz="4" w:space="0" w:color="auto"/>
+            </w:tcBorders>
             <w:vAlign w:val="center"/>
           </w:tcPr>
           <w:p>
@@ -742,6 +752,12 @@
         <w:tc>
           <w:tcPr>
             <w:tcW w:w="2972" w:type="dxa"/>
+            <w:tcBorders>
+              <w:top w:val="single" w:sz="4" w:space="0" w:color="auto"/>
+              <w:left w:val="single" w:sz="4" w:space="0" w:color="auto"/>
+              <w:bottom w:val="single" w:sz="4" w:space="0" w:color="auto"/>
+              <w:right w:val="single" w:sz="4" w:space="0" w:color="auto"/>
+            </w:tcBorders>
             <w:shd w:val="clear" w:color="auto" w:fill="181749"/>
             <w:vAlign w:val="center"/>
           </w:tcPr>
@@ -750,18 +766,14 @@
               <w:spacing w:before="40" w:after="40"/>
               <w:rPr>
                 <w:rFonts w:cs="Open Sans"/>
-                <w:b/>
-                <w:bCs/>
-                <w:color w:val="000000" w:themeColor="text1"/>
+                <w:color w:val="FFFFFF" w:themeColor="background1"/>
                 <w:szCs w:val="20"/>
               </w:rPr>
             </w:pPr>
             <w:r>
               <w:rPr>
                 <w:rFonts w:cs="Open Sans"/>
-                <w:b/>
-                <w:bCs/>
-                <w:color w:val="000000" w:themeColor="text1"/>
+                <w:color w:val="FFFFFF" w:themeColor="background1"/>
                 <w:szCs w:val="20"/>
               </w:rPr>
               <w:t>Call</w:t>
@@ -771,6 +783,9 @@
         <w:tc>
           <w:tcPr>
             <w:tcW w:w="6237" w:type="dxa"/>
+            <w:tcBorders>
+              <w:left w:val="single" w:sz="4" w:space="0" w:color="auto"/>
+            </w:tcBorders>
             <w:vAlign w:val="center"/>
           </w:tcPr>
           <w:p>
@@ -804,6 +819,12 @@
         <w:tc>
           <w:tcPr>
             <w:tcW w:w="2972" w:type="dxa"/>
+            <w:tcBorders>
+              <w:top w:val="single" w:sz="4" w:space="0" w:color="auto"/>
+              <w:left w:val="single" w:sz="4" w:space="0" w:color="auto"/>
+              <w:bottom w:val="single" w:sz="4" w:space="0" w:color="auto"/>
+              <w:right w:val="single" w:sz="4" w:space="0" w:color="auto"/>
+            </w:tcBorders>
             <w:shd w:val="clear" w:color="auto" w:fill="181749"/>
             <w:vAlign w:val="center"/>
           </w:tcPr>
@@ -812,18 +833,14 @@
               <w:spacing w:before="40" w:after="40"/>
               <w:rPr>
                 <w:rFonts w:cs="Open Sans"/>
-                <w:b/>
-                <w:bCs/>
-                <w:color w:val="000000" w:themeColor="text1"/>
+                <w:color w:val="FFFFFF" w:themeColor="background1"/>
                 <w:szCs w:val="20"/>
               </w:rPr>
             </w:pPr>
             <w:r>
               <w:rPr>
                 <w:rFonts w:cs="Open Sans"/>
-                <w:b/>
-                <w:bCs/>
-                <w:color w:val="000000" w:themeColor="text1"/>
+                <w:color w:val="FFFFFF" w:themeColor="background1"/>
                 <w:szCs w:val="20"/>
               </w:rPr>
               <w:t>Grant Agreement No.</w:t>
@@ -833,6 +850,9 @@
         <w:tc>
           <w:tcPr>
             <w:tcW w:w="6237" w:type="dxa"/>
+            <w:tcBorders>
+              <w:left w:val="single" w:sz="4" w:space="0" w:color="auto"/>
+            </w:tcBorders>
             <w:vAlign w:val="center"/>
           </w:tcPr>
           <w:p>
@@ -863,6 +883,12 @@
         <w:tc>
           <w:tcPr>
             <w:tcW w:w="2972" w:type="dxa"/>
+            <w:tcBorders>
+              <w:top w:val="single" w:sz="4" w:space="0" w:color="auto"/>
+              <w:left w:val="single" w:sz="4" w:space="0" w:color="auto"/>
+              <w:bottom w:val="single" w:sz="4" w:space="0" w:color="auto"/>
+              <w:right w:val="single" w:sz="4" w:space="0" w:color="auto"/>
+            </w:tcBorders>
             <w:shd w:val="clear" w:color="auto" w:fill="181749"/>
             <w:vAlign w:val="center"/>
           </w:tcPr>
@@ -871,18 +897,14 @@
               <w:spacing w:before="40" w:after="40"/>
               <w:rPr>
                 <w:rFonts w:cs="Open Sans"/>
-                <w:b/>
-                <w:bCs/>
-                <w:color w:val="000000" w:themeColor="text1"/>
+                <w:color w:val="FFFFFF" w:themeColor="background1"/>
                 <w:szCs w:val="20"/>
               </w:rPr>
             </w:pPr>
             <w:r>
               <w:rPr>
                 <w:rFonts w:cs="Open Sans"/>
-                <w:b/>
-                <w:bCs/>
-                <w:color w:val="000000" w:themeColor="text1"/>
+                <w:color w:val="FFFFFF" w:themeColor="background1"/>
                 <w:szCs w:val="20"/>
               </w:rPr>
               <w:t>Type</w:t>
@@ -892,6 +914,9 @@
         <w:tc>
           <w:tcPr>
             <w:tcW w:w="6237" w:type="dxa"/>
+            <w:tcBorders>
+              <w:left w:val="single" w:sz="4" w:space="0" w:color="auto"/>
+            </w:tcBorders>
             <w:vAlign w:val="center"/>
           </w:tcPr>
           <w:p>
@@ -921,6 +946,12 @@
         <w:tc>
           <w:tcPr>
             <w:tcW w:w="2972" w:type="dxa"/>
+            <w:tcBorders>
+              <w:top w:val="single" w:sz="4" w:space="0" w:color="auto"/>
+              <w:left w:val="single" w:sz="4" w:space="0" w:color="auto"/>
+              <w:bottom w:val="single" w:sz="4" w:space="0" w:color="auto"/>
+              <w:right w:val="single" w:sz="4" w:space="0" w:color="auto"/>
+            </w:tcBorders>
             <w:shd w:val="clear" w:color="auto" w:fill="181749"/>
             <w:vAlign w:val="center"/>
           </w:tcPr>
@@ -929,18 +960,14 @@
               <w:spacing w:before="40" w:after="40"/>
               <w:rPr>
                 <w:rFonts w:cs="Open Sans"/>
-                <w:b/>
-                <w:bCs/>
-                <w:color w:val="000000" w:themeColor="text1"/>
+                <w:color w:val="FFFFFF" w:themeColor="background1"/>
                 <w:szCs w:val="20"/>
               </w:rPr>
             </w:pPr>
             <w:r>
               <w:rPr>
                 <w:rFonts w:cs="Open Sans"/>
-                <w:b/>
-                <w:bCs/>
-                <w:color w:val="000000" w:themeColor="text1"/>
+                <w:color w:val="FFFFFF" w:themeColor="background1"/>
                 <w:szCs w:val="20"/>
               </w:rPr>
               <w:t>Project Starting Date</w:t>
@@ -950,6 +977,9 @@
         <w:tc>
           <w:tcPr>
             <w:tcW w:w="6237" w:type="dxa"/>
+            <w:tcBorders>
+              <w:left w:val="single" w:sz="4" w:space="0" w:color="auto"/>
+            </w:tcBorders>
             <w:vAlign w:val="center"/>
           </w:tcPr>
           <w:p>
@@ -979,6 +1009,12 @@
         <w:tc>
           <w:tcPr>
             <w:tcW w:w="2972" w:type="dxa"/>
+            <w:tcBorders>
+              <w:top w:val="single" w:sz="4" w:space="0" w:color="auto"/>
+              <w:left w:val="single" w:sz="4" w:space="0" w:color="auto"/>
+              <w:bottom w:val="single" w:sz="4" w:space="0" w:color="auto"/>
+              <w:right w:val="single" w:sz="4" w:space="0" w:color="auto"/>
+            </w:tcBorders>
             <w:shd w:val="clear" w:color="auto" w:fill="181749"/>
             <w:vAlign w:val="center"/>
           </w:tcPr>
@@ -987,18 +1023,14 @@
               <w:spacing w:before="40" w:after="40"/>
               <w:rPr>
                 <w:rFonts w:cs="Open Sans"/>
-                <w:b/>
-                <w:bCs/>
-                <w:color w:val="000000" w:themeColor="text1"/>
+                <w:color w:val="FFFFFF" w:themeColor="background1"/>
                 <w:szCs w:val="20"/>
               </w:rPr>
             </w:pPr>
             <w:r>
               <w:rPr>
                 <w:rFonts w:cs="Open Sans"/>
-                <w:b/>
-                <w:bCs/>
-                <w:color w:val="000000" w:themeColor="text1"/>
+                <w:color w:val="FFFFFF" w:themeColor="background1"/>
                 <w:szCs w:val="20"/>
               </w:rPr>
               <w:t>Project Duration</w:t>
@@ -1008,6 +1040,9 @@
         <w:tc>
           <w:tcPr>
             <w:tcW w:w="6237" w:type="dxa"/>
+            <w:tcBorders>
+              <w:left w:val="single" w:sz="4" w:space="0" w:color="auto"/>
+            </w:tcBorders>
             <w:vAlign w:val="center"/>
           </w:tcPr>
           <w:p>
@@ -1037,6 +1072,12 @@
         <w:tc>
           <w:tcPr>
             <w:tcW w:w="2972" w:type="dxa"/>
+            <w:tcBorders>
+              <w:top w:val="single" w:sz="4" w:space="0" w:color="auto"/>
+              <w:left w:val="single" w:sz="4" w:space="0" w:color="auto"/>
+              <w:bottom w:val="single" w:sz="4" w:space="0" w:color="auto"/>
+              <w:right w:val="single" w:sz="4" w:space="0" w:color="auto"/>
+            </w:tcBorders>
             <w:shd w:val="clear" w:color="auto" w:fill="181749"/>
             <w:vAlign w:val="center"/>
           </w:tcPr>
@@ -1045,18 +1086,14 @@
               <w:spacing w:before="40" w:after="40"/>
               <w:rPr>
                 <w:rFonts w:cs="Open Sans"/>
-                <w:b/>
-                <w:bCs/>
-                <w:color w:val="000000" w:themeColor="text1"/>
+                <w:color w:val="FFFFFF" w:themeColor="background1"/>
                 <w:szCs w:val="20"/>
               </w:rPr>
             </w:pPr>
             <w:r>
               <w:rPr>
                 <w:rFonts w:cs="Open Sans"/>
-                <w:b/>
-                <w:bCs/>
-                <w:color w:val="000000" w:themeColor="text1"/>
+                <w:color w:val="FFFFFF" w:themeColor="background1"/>
                 <w:szCs w:val="20"/>
               </w:rPr>
               <w:t>Coordinator</w:t>
@@ -1066,6 +1103,9 @@
         <w:tc>
           <w:tcPr>
             <w:tcW w:w="6237" w:type="dxa"/>
+            <w:tcBorders>
+              <w:left w:val="single" w:sz="4" w:space="0" w:color="auto"/>
+            </w:tcBorders>
             <w:vAlign w:val="center"/>
           </w:tcPr>
           <w:p>
@@ -1157,18 +1197,14 @@
               <w:spacing w:before="40" w:after="40"/>
               <w:rPr>
                 <w:rFonts w:cs="Open Sans"/>
-                <w:b/>
-                <w:bCs/>
-                <w:color w:val="000000" w:themeColor="text1"/>
+                <w:color w:val="FFFFFF" w:themeColor="background1"/>
                 <w:szCs w:val="20"/>
               </w:rPr>
             </w:pPr>
             <w:r>
               <w:rPr>
                 <w:rFonts w:cs="Open Sans"/>
-                <w:b/>
-                <w:bCs/>
-                <w:color w:val="000000" w:themeColor="text1"/>
+                <w:color w:val="FFFFFF" w:themeColor="background1"/>
                 <w:szCs w:val="20"/>
               </w:rPr>
               <w:t xml:space="preserve">Deliverable Name </w:t>
@@ -1208,18 +1244,14 @@
               <w:spacing w:before="40" w:after="40"/>
               <w:rPr>
                 <w:rFonts w:cs="Open Sans"/>
-                <w:b/>
-                <w:bCs/>
-                <w:color w:val="000000" w:themeColor="text1"/>
+                <w:color w:val="FFFFFF" w:themeColor="background1"/>
                 <w:szCs w:val="20"/>
               </w:rPr>
             </w:pPr>
             <w:r>
               <w:rPr>
                 <w:rFonts w:cs="Open Sans"/>
-                <w:b/>
-                <w:bCs/>
-                <w:color w:val="000000" w:themeColor="text1"/>
+                <w:color w:val="FFFFFF" w:themeColor="background1"/>
                 <w:szCs w:val="20"/>
               </w:rPr>
               <w:t>Due Date</w:t>
@@ -1259,18 +1291,14 @@
               <w:spacing w:before="40" w:after="40"/>
               <w:rPr>
                 <w:rFonts w:cs="Open Sans"/>
-                <w:b/>
-                <w:bCs/>
-                <w:color w:val="000000" w:themeColor="text1"/>
+                <w:color w:val="FFFFFF" w:themeColor="background1"/>
                 <w:szCs w:val="20"/>
               </w:rPr>
             </w:pPr>
             <w:r>
               <w:rPr>
                 <w:rFonts w:cs="Open Sans"/>
-                <w:b/>
-                <w:bCs/>
-                <w:color w:val="000000" w:themeColor="text1"/>
+                <w:color w:val="FFFFFF" w:themeColor="background1"/>
                 <w:szCs w:val="20"/>
               </w:rPr>
               <w:t>Delivery Date</w:t>
@@ -1310,18 +1338,14 @@
               <w:spacing w:before="40" w:after="40"/>
               <w:rPr>
                 <w:rFonts w:cs="Open Sans"/>
-                <w:b/>
-                <w:bCs/>
-                <w:color w:val="000000" w:themeColor="text1"/>
+                <w:color w:val="FFFFFF" w:themeColor="background1"/>
                 <w:szCs w:val="20"/>
               </w:rPr>
             </w:pPr>
             <w:r>
               <w:rPr>
                 <w:rFonts w:cs="Open Sans"/>
-                <w:b/>
-                <w:bCs/>
-                <w:color w:val="000000" w:themeColor="text1"/>
+                <w:color w:val="FFFFFF" w:themeColor="background1"/>
                 <w:szCs w:val="20"/>
               </w:rPr>
               <w:t>Type</w:t>
@@ -1361,18 +1385,14 @@
               <w:spacing w:before="40" w:after="40"/>
               <w:rPr>
                 <w:rFonts w:cs="Open Sans"/>
-                <w:b/>
-                <w:bCs/>
-                <w:color w:val="000000" w:themeColor="text1"/>
+                <w:color w:val="FFFFFF" w:themeColor="background1"/>
                 <w:szCs w:val="20"/>
               </w:rPr>
             </w:pPr>
             <w:r>
               <w:rPr>
                 <w:rFonts w:cs="Open Sans"/>
-                <w:b/>
-                <w:bCs/>
-                <w:color w:val="000000" w:themeColor="text1"/>
+                <w:color w:val="FFFFFF" w:themeColor="background1"/>
                 <w:szCs w:val="20"/>
               </w:rPr>
               <w:t>Dissemination Level</w:t>
@@ -1412,18 +1432,14 @@
               <w:spacing w:before="40" w:after="40"/>
               <w:rPr>
                 <w:rFonts w:cs="Open Sans"/>
-                <w:b/>
-                <w:bCs/>
-                <w:color w:val="000000" w:themeColor="text1"/>
+                <w:color w:val="FFFFFF" w:themeColor="background1"/>
                 <w:szCs w:val="20"/>
               </w:rPr>
             </w:pPr>
             <w:r>
               <w:rPr>
                 <w:rFonts w:cs="Open Sans"/>
-                <w:b/>
-                <w:bCs/>
-                <w:color w:val="000000" w:themeColor="text1"/>
+                <w:color w:val="FFFFFF" w:themeColor="background1"/>
                 <w:szCs w:val="20"/>
               </w:rPr>
               <w:t>Main Author(s)</w:t>
@@ -1475,18 +1491,14 @@
               <w:spacing w:before="40" w:after="40"/>
               <w:rPr>
                 <w:rFonts w:cs="Open Sans"/>
-                <w:b/>
-                <w:bCs/>
-                <w:color w:val="000000" w:themeColor="text1"/>
+                <w:color w:val="FFFFFF" w:themeColor="background1"/>
                 <w:szCs w:val="20"/>
               </w:rPr>
             </w:pPr>
             <w:r>
               <w:rPr>
                 <w:rFonts w:cs="Open Sans"/>
-                <w:b/>
-                <w:bCs/>
-                <w:color w:val="000000" w:themeColor="text1"/>
+                <w:color w:val="FFFFFF" w:themeColor="background1"/>
                 <w:szCs w:val="20"/>
               </w:rPr>
               <w:t>Contributors</w:t>
@@ -1526,18 +1538,14 @@
               <w:spacing w:before="40" w:after="40"/>
               <w:rPr>
                 <w:rFonts w:cs="Open Sans"/>
-                <w:b/>
-                <w:bCs/>
-                <w:color w:val="000000" w:themeColor="text1"/>
+                <w:color w:val="FFFFFF" w:themeColor="background1"/>
                 <w:szCs w:val="20"/>
               </w:rPr>
             </w:pPr>
             <w:r>
               <w:rPr>
                 <w:rFonts w:cs="Open Sans"/>
-                <w:b/>
-                <w:bCs/>
-                <w:color w:val="000000" w:themeColor="text1"/>
+                <w:color w:val="FFFFFF" w:themeColor="background1"/>
                 <w:szCs w:val="20"/>
               </w:rPr>
               <w:t>Document Reviewers</w:t>
@@ -1579,18 +1587,14 @@
               <w:spacing w:before="40" w:after="40"/>
               <w:rPr>
                 <w:rFonts w:cs="Open Sans"/>
-                <w:b/>
-                <w:bCs/>
-                <w:color w:val="000000" w:themeColor="text1"/>
+                <w:color w:val="FFFFFF" w:themeColor="background1"/>
                 <w:szCs w:val="20"/>
               </w:rPr>
             </w:pPr>
             <w:r>
               <w:rPr>
                 <w:rFonts w:cs="Open Sans"/>
-                <w:b/>
-                <w:bCs/>
-                <w:color w:val="000000" w:themeColor="text1"/>
+                <w:color w:val="FFFFFF" w:themeColor="background1"/>
                 <w:szCs w:val="20"/>
               </w:rPr>
               <w:t>Security Reviewer</w:t>
@@ -1765,7 +1769,7 @@
                 <w:rFonts w:cs="Open Sans"/>
                 <w:b/>
                 <w:bCs/>
-                <w:color w:val="000000" w:themeColor="text1"/>
+                <w:color w:val="FFFFFF" w:themeColor="background1"/>
                 <w:szCs w:val="18"/>
               </w:rPr>
             </w:pPr>
@@ -1775,7 +1779,7 @@
                 <w:rFonts w:cs="Open Sans"/>
                 <w:b/>
                 <w:bCs/>
-                <w:color w:val="000000" w:themeColor="text1"/>
+                <w:color w:val="FFFFFF" w:themeColor="background1"/>
                 <w:szCs w:val="18"/>
               </w:rPr>
               <w:t>Version</w:t>
@@ -1796,7 +1800,7 @@
                 <w:rFonts w:cs="Open Sans"/>
                 <w:b/>
                 <w:bCs/>
-                <w:color w:val="000000" w:themeColor="text1"/>
+                <w:color w:val="FFFFFF" w:themeColor="background1"/>
                 <w:szCs w:val="18"/>
               </w:rPr>
             </w:pPr>
@@ -1805,7 +1809,7 @@
                 <w:rFonts w:cs="Open Sans"/>
                 <w:b/>
                 <w:bCs/>
-                <w:color w:val="000000" w:themeColor="text1"/>
+                <w:color w:val="FFFFFF" w:themeColor="background1"/>
                 <w:szCs w:val="18"/>
               </w:rPr>
               <w:t>Issue Date</w:t>
@@ -1826,7 +1830,7 @@
                 <w:rFonts w:cs="Open Sans"/>
                 <w:b/>
                 <w:bCs/>
-                <w:color w:val="000000" w:themeColor="text1"/>
+                <w:color w:val="FFFFFF" w:themeColor="background1"/>
                 <w:szCs w:val="18"/>
               </w:rPr>
             </w:pPr>
@@ -1835,7 +1839,7 @@
                 <w:rFonts w:cs="Open Sans"/>
                 <w:b/>
                 <w:bCs/>
-                <w:color w:val="000000" w:themeColor="text1"/>
+                <w:color w:val="FFFFFF" w:themeColor="background1"/>
                 <w:szCs w:val="18"/>
               </w:rPr>
               <w:t>Author(s)</w:t>
@@ -1856,7 +1860,7 @@
                 <w:rFonts w:cs="Open Sans"/>
                 <w:b/>
                 <w:bCs/>
-                <w:color w:val="000000" w:themeColor="text1"/>
+                <w:color w:val="FFFFFF" w:themeColor="background1"/>
                 <w:szCs w:val="18"/>
               </w:rPr>
             </w:pPr>
@@ -1865,7 +1869,7 @@
                 <w:rFonts w:cs="Open Sans"/>
                 <w:b/>
                 <w:bCs/>
-                <w:color w:val="000000" w:themeColor="text1"/>
+                <w:color w:val="FFFFFF" w:themeColor="background1"/>
                 <w:szCs w:val="18"/>
               </w:rPr>
               <w:t>Content and Changes</w:t>
@@ -2143,7 +2147,7 @@
               <w:spacing w:before="40" w:after="40"/>
               <w:rPr>
                 <w:rFonts w:cs="Open Sans"/>
-                <w:color w:val="000000" w:themeColor="text1"/>
+                <w:color w:val="FFFFFF" w:themeColor="background1"/>
                 <w:szCs w:val="22"/>
               </w:rPr>
             </w:pPr>
@@ -2159,7 +2163,7 @@
               <w:spacing w:before="40" w:after="40"/>
               <w:rPr>
                 <w:rFonts w:cs="Open Sans"/>
-                <w:color w:val="000000" w:themeColor="text1"/>
+                <w:color w:val="FFFFFF" w:themeColor="background1"/>
                 <w:szCs w:val="22"/>
               </w:rPr>
             </w:pPr>
@@ -2175,7 +2179,7 @@
               <w:spacing w:before="40" w:after="40"/>
               <w:rPr>
                 <w:rFonts w:cs="Open Sans"/>
-                <w:color w:val="000000" w:themeColor="text1"/>
+                <w:color w:val="FFFFFF" w:themeColor="background1"/>
                 <w:szCs w:val="22"/>
               </w:rPr>
             </w:pPr>
@@ -2192,7 +2196,7 @@
               <w:jc w:val="both"/>
               <w:rPr>
                 <w:rFonts w:cs="Open Sans"/>
-                <w:color w:val="000000" w:themeColor="text1"/>
+                <w:color w:val="FFFFFF" w:themeColor="background1"/>
                 <w:szCs w:val="22"/>
               </w:rPr>
             </w:pPr>
@@ -2213,7 +2217,7 @@
               <w:spacing w:before="40" w:after="40"/>
               <w:rPr>
                 <w:rFonts w:cs="Open Sans"/>
-                <w:color w:val="000000" w:themeColor="text1"/>
+                <w:color w:val="FFFFFF" w:themeColor="background1"/>
                 <w:szCs w:val="22"/>
               </w:rPr>
             </w:pPr>
@@ -2229,7 +2233,7 @@
               <w:spacing w:before="40" w:after="40"/>
               <w:rPr>
                 <w:rFonts w:cs="Open Sans"/>
-                <w:color w:val="000000" w:themeColor="text1"/>
+                <w:color w:val="FFFFFF" w:themeColor="background1"/>
                 <w:szCs w:val="22"/>
               </w:rPr>
             </w:pPr>
@@ -2245,7 +2249,7 @@
               <w:spacing w:before="40" w:after="40"/>
               <w:rPr>
                 <w:rFonts w:cs="Open Sans"/>
-                <w:color w:val="000000" w:themeColor="text1"/>
+                <w:color w:val="FFFFFF" w:themeColor="background1"/>
                 <w:szCs w:val="22"/>
               </w:rPr>
             </w:pPr>
@@ -2262,7 +2266,7 @@
               <w:jc w:val="both"/>
               <w:rPr>
                 <w:rFonts w:cs="Open Sans"/>
-                <w:color w:val="000000" w:themeColor="text1"/>
+                <w:color w:val="FFFFFF" w:themeColor="background1"/>
                 <w:szCs w:val="22"/>
                 <w:lang w:val="en-US"/>
               </w:rPr>
@@ -2284,7 +2288,7 @@
               <w:spacing w:before="40" w:after="40"/>
               <w:rPr>
                 <w:rFonts w:cs="Open Sans"/>
-                <w:color w:val="000000" w:themeColor="text1"/>
+                <w:color w:val="FFFFFF" w:themeColor="background1"/>
                 <w:szCs w:val="22"/>
               </w:rPr>
             </w:pPr>
@@ -2300,7 +2304,7 @@
               <w:spacing w:before="40" w:after="40"/>
               <w:rPr>
                 <w:rFonts w:cs="Open Sans"/>
-                <w:color w:val="000000" w:themeColor="text1"/>
+                <w:color w:val="FFFFFF" w:themeColor="background1"/>
                 <w:szCs w:val="22"/>
               </w:rPr>
             </w:pPr>
@@ -2316,7 +2320,7 @@
               <w:spacing w:before="40" w:after="40"/>
               <w:rPr>
                 <w:rFonts w:cs="Open Sans"/>
-                <w:color w:val="000000" w:themeColor="text1"/>
+                <w:color w:val="FFFFFF" w:themeColor="background1"/>
                 <w:szCs w:val="22"/>
               </w:rPr>
             </w:pPr>
@@ -2333,7 +2337,7 @@
               <w:jc w:val="both"/>
               <w:rPr>
                 <w:rFonts w:cs="Open Sans"/>
-                <w:color w:val="000000" w:themeColor="text1"/>
+                <w:color w:val="FFFFFF" w:themeColor="background1"/>
                 <w:szCs w:val="22"/>
                 <w:lang w:val="el-GR"/>
               </w:rPr>
@@ -2810,7 +2814,7 @@
         <mc:AlternateContent>
           <mc:Choice Requires="wpg">
             <w:drawing>
-              <wp:anchor distT="0" distB="0" distL="114300" distR="114300" simplePos="0" relativeHeight="251702274" behindDoc="0" locked="0" layoutInCell="1" allowOverlap="1" wp14:anchorId="1F9ABE74" wp14:editId="152D3201">
+              <wp:anchor distT="0" distB="0" distL="114300" distR="114300" simplePos="0" relativeHeight="251702274" behindDoc="0" locked="0" layoutInCell="1" allowOverlap="1" wp14:anchorId="1F9ABE74" wp14:editId="2EA0E8CC">
                 <wp:simplePos x="0" y="0"/>
                 <wp:positionH relativeFrom="column">
                   <wp:posOffset>190500</wp:posOffset>
@@ -3401,7 +3405,7 @@
           <w:color w:val="000000" w:themeColor="text1"/>
         </w:rPr>
         <w:drawing>
-          <wp:anchor distT="0" distB="0" distL="114300" distR="114300" simplePos="0" relativeHeight="251669506" behindDoc="0" locked="0" layoutInCell="1" allowOverlap="1" wp14:anchorId="0877CAD5" wp14:editId="1B0E7863">
+          <wp:anchor distT="0" distB="0" distL="114300" distR="114300" simplePos="0" relativeHeight="251669506" behindDoc="0" locked="0" layoutInCell="1" allowOverlap="1" wp14:anchorId="0877CAD5" wp14:editId="6DF6C2ED">
             <wp:simplePos x="0" y="0"/>
             <wp:positionH relativeFrom="column">
               <wp:posOffset>-6680200</wp:posOffset>
@@ -3470,7 +3474,7 @@
           <w:color w:val="000000" w:themeColor="text1"/>
         </w:rPr>
         <w:drawing>
-          <wp:anchor distT="0" distB="0" distL="114300" distR="114300" simplePos="0" relativeHeight="251678722" behindDoc="0" locked="0" layoutInCell="1" allowOverlap="1" wp14:anchorId="5C90F522" wp14:editId="24A64E16">
+          <wp:anchor distT="0" distB="0" distL="114300" distR="114300" simplePos="0" relativeHeight="251678722" behindDoc="0" locked="0" layoutInCell="1" allowOverlap="1" wp14:anchorId="5C90F522" wp14:editId="272267D9">
             <wp:simplePos x="0" y="0"/>
             <wp:positionH relativeFrom="column">
               <wp:posOffset>7186930</wp:posOffset>
@@ -3585,7 +3589,7 @@
           <w:color w:val="000000" w:themeColor="text1"/>
         </w:rPr>
         <w:drawing>
-          <wp:anchor distT="0" distB="0" distL="114300" distR="114300" simplePos="0" relativeHeight="251692034" behindDoc="0" locked="0" layoutInCell="1" allowOverlap="1" wp14:anchorId="74CEF153" wp14:editId="68E7EE1A">
+          <wp:anchor distT="0" distB="0" distL="114300" distR="114300" simplePos="0" relativeHeight="251692034" behindDoc="0" locked="0" layoutInCell="1" allowOverlap="1" wp14:anchorId="74CEF153" wp14:editId="3E1783A7">
             <wp:simplePos x="0" y="0"/>
             <wp:positionH relativeFrom="column">
               <wp:posOffset>-9588500</wp:posOffset>
@@ -4136,7 +4140,7 @@
           <w:color w:val="000000" w:themeColor="text1"/>
         </w:rPr>
         <w:drawing>
-          <wp:anchor distT="0" distB="0" distL="114300" distR="114300" simplePos="0" relativeHeight="251680770" behindDoc="0" locked="0" layoutInCell="1" allowOverlap="1" wp14:anchorId="74062C0A" wp14:editId="1B2155DE">
+          <wp:anchor distT="0" distB="0" distL="114300" distR="114300" simplePos="0" relativeHeight="251680770" behindDoc="0" locked="0" layoutInCell="1" allowOverlap="1" wp14:anchorId="74062C0A" wp14:editId="313AF6B6">
             <wp:simplePos x="0" y="0"/>
             <wp:positionH relativeFrom="column">
               <wp:posOffset>-6737350</wp:posOffset>
@@ -11388,6 +11392,8 @@
             <w:pPr>
               <w:rPr>
                 <w:rFonts w:eastAsia="Times New Roman" w:cs="Times New Roman"/>
+                <w:b/>
+                <w:bCs/>
                 <w:color w:val="000000" w:themeColor="text1"/>
                 <w:kern w:val="0"/>
                 <w:lang w:eastAsia="en-GB"/>
@@ -11397,6 +11403,8 @@
             <w:r>
               <w:rPr>
                 <w:rFonts w:eastAsia="Times New Roman" w:cs="Times New Roman"/>
+                <w:b/>
+                <w:bCs/>
                 <w:color w:val="000000" w:themeColor="text1"/>
                 <w:kern w:val="0"/>
                 <w:lang w:eastAsia="en-GB"/>
@@ -11415,6 +11423,8 @@
             <w:pPr>
               <w:rPr>
                 <w:rFonts w:eastAsia="Times New Roman" w:cs="Times New Roman"/>
+                <w:b/>
+                <w:bCs/>
                 <w:color w:val="000000" w:themeColor="text1"/>
                 <w:kern w:val="0"/>
                 <w:lang w:eastAsia="en-GB"/>
@@ -11424,6 +11434,8 @@
             <w:r>
               <w:rPr>
                 <w:rFonts w:eastAsia="Times New Roman" w:cs="Times New Roman"/>
+                <w:b/>
+                <w:bCs/>
                 <w:color w:val="000000" w:themeColor="text1"/>
                 <w:kern w:val="0"/>
                 <w:lang w:eastAsia="en-GB"/>
@@ -11442,6 +11454,8 @@
             <w:pPr>
               <w:rPr>
                 <w:rFonts w:eastAsia="Times New Roman" w:cs="Times New Roman"/>
+                <w:b/>
+                <w:bCs/>
                 <w:color w:val="000000" w:themeColor="text1"/>
                 <w:kern w:val="0"/>
                 <w:lang w:eastAsia="en-GB"/>
@@ -11451,6 +11465,8 @@
             <w:r>
               <w:rPr>
                 <w:rFonts w:eastAsia="Times New Roman" w:cs="Times New Roman"/>
+                <w:b/>
+                <w:bCs/>
                 <w:color w:val="000000" w:themeColor="text1"/>
                 <w:kern w:val="0"/>
                 <w:lang w:eastAsia="en-GB"/>
@@ -11469,6 +11485,8 @@
             <w:pPr>
               <w:rPr>
                 <w:rFonts w:eastAsia="Times New Roman" w:cs="Times New Roman"/>
+                <w:b/>
+                <w:bCs/>
                 <w:color w:val="000000" w:themeColor="text1"/>
                 <w:kern w:val="0"/>
                 <w:lang w:eastAsia="en-GB"/>
@@ -11478,6 +11496,8 @@
             <w:r>
               <w:rPr>
                 <w:rFonts w:eastAsia="Times New Roman" w:cs="Times New Roman"/>
+                <w:b/>
+                <w:bCs/>
                 <w:color w:val="000000" w:themeColor="text1"/>
                 <w:kern w:val="0"/>
                 <w:lang w:eastAsia="en-GB"/>
@@ -14659,6 +14679,7 @@
         <w:rPr>
           <w:color w:val="000000" w:themeColor="text1"/>
         </w:rPr>
+        <w:lastRenderedPageBreak/>
         <w:t>another. It does not concern the instrument's own conventions. An attribution share of one half, adopted as a neutral central value with a sensitivity band because appraisal guidance treats attribution as a case-by-case judgement and not a published constant, is not a British fact that Spain lacks; it is a stated modelling choice belonging to the framework. Applying one convention across four editions of one instrument is consistency and not transfer, and requires no borrowing decision. Where a multiplier is instead an empirical rate measured on a British programme, the rule does apply, we record that fact on the cell, and Section 10 names it as a limitation of the present version.</w:t>
       </w:r>
     </w:p>
@@ -14749,6 +14770,7 @@
         <w:rPr>
           <w:color w:val="000000" w:themeColor="text1"/>
         </w:rPr>
+        <w:lastRenderedPageBreak/>
         <w:t>its construction, the ratios it produces for the three European countries, and two weaknesses in the anchor from which those ratios are derived. We set it out there because the sensitivity table reports robustness under this method and did not select it, and the reader is better served by the derivation sitting beside the normalisers it generates.</w:t>
       </w:r>
     </w:p>
@@ -15142,6 +15164,7 @@
         <w:rPr>
           <w:color w:val="000000" w:themeColor="text1"/>
         </w:rPr>
+        <w:lastRenderedPageBreak/>
         <w:t>parsed is counted as a failure and not skipped, so an undocumented derivation cannot pass silently. Beneath both tests sits a document generated from the parameters themselves at every run, recording the full chain behind every value added, from raw value through each multiplier to the shipped figure, so the derivation travels with the deliverable and cannot drift from the values without the check failing first. Both tests are negative-tested by mutation, so a check that cannot be made to fail is not counted.</w:t>
       </w:r>
     </w:p>
@@ -15245,6 +15268,7 @@
       </w:pPr>
       <w:bookmarkStart w:id="18" w:name="_Toc238809496"/>
       <w:r>
+        <w:lastRenderedPageBreak/>
         <w:t xml:space="preserve">Table </w:t>
       </w:r>
       <w:fldSimple w:instr=" SEQ Table \* ARABIC ">
@@ -15274,10 +15298,10 @@
         <w:tblLook w:val="04A0" w:firstRow="1" w:lastRow="0" w:firstColumn="1" w:lastColumn="0" w:noHBand="0" w:noVBand="1"/>
       </w:tblPr>
       <w:tblGrid>
-        <w:gridCol w:w="4585"/>
-        <w:gridCol w:w="1530"/>
+        <w:gridCol w:w="4519"/>
         <w:gridCol w:w="1528"/>
-        <w:gridCol w:w="1373"/>
+        <w:gridCol w:w="1526"/>
+        <w:gridCol w:w="1443"/>
       </w:tblGrid>
       <w:tr>
         <w:tc>
@@ -15289,11 +15313,15 @@
             <w:pPr>
               <w:spacing w:line="278" w:lineRule="auto"/>
               <w:rPr>
-                <w:color w:val="000000" w:themeColor="text1"/>
-              </w:rPr>
-            </w:pPr>
-            <w:r>
-              <w:rPr>
+                <w:b/>
+                <w:bCs/>
+                <w:color w:val="000000" w:themeColor="text1"/>
+              </w:rPr>
+            </w:pPr>
+            <w:r>
+              <w:rPr>
+                <w:b/>
+                <w:bCs/>
                 <w:color w:val="000000" w:themeColor="text1"/>
               </w:rPr>
               <w:t>Line</w:t>
@@ -15309,11 +15337,15 @@
             <w:pPr>
               <w:spacing w:line="278" w:lineRule="auto"/>
               <w:rPr>
-                <w:color w:val="000000" w:themeColor="text1"/>
-              </w:rPr>
-            </w:pPr>
-            <w:r>
-              <w:rPr>
+                <w:b/>
+                <w:bCs/>
+                <w:color w:val="000000" w:themeColor="text1"/>
+              </w:rPr>
+            </w:pPr>
+            <w:r>
+              <w:rPr>
+                <w:b/>
+                <w:bCs/>
                 <w:color w:val="000000" w:themeColor="text1"/>
               </w:rPr>
               <w:t>Build</w:t>
@@ -15329,11 +15361,15 @@
             <w:pPr>
               <w:spacing w:line="278" w:lineRule="auto"/>
               <w:rPr>
-                <w:color w:val="000000" w:themeColor="text1"/>
-              </w:rPr>
-            </w:pPr>
-            <w:r>
-              <w:rPr>
+                <w:b/>
+                <w:bCs/>
+                <w:color w:val="000000" w:themeColor="text1"/>
+              </w:rPr>
+            </w:pPr>
+            <w:r>
+              <w:rPr>
+                <w:b/>
+                <w:bCs/>
                 <w:color w:val="000000" w:themeColor="text1"/>
               </w:rPr>
               <w:t>Published</w:t>
@@ -15349,11 +15385,15 @@
             <w:pPr>
               <w:spacing w:line="278" w:lineRule="auto"/>
               <w:rPr>
-                <w:color w:val="000000" w:themeColor="text1"/>
-              </w:rPr>
-            </w:pPr>
-            <w:r>
-              <w:rPr>
+                <w:b/>
+                <w:bCs/>
+                <w:color w:val="000000" w:themeColor="text1"/>
+              </w:rPr>
+            </w:pPr>
+            <w:r>
+              <w:rPr>
+                <w:b/>
+                <w:bCs/>
                 <w:color w:val="000000" w:themeColor="text1"/>
               </w:rPr>
               <w:t>Divergence</w:t>
@@ -17786,6 +17826,7 @@
         <w:rPr>
           <w:color w:val="000000" w:themeColor="text1"/>
         </w:rPr>
+        <w:lastRenderedPageBreak/>
         <w:t>Two lines in the table show what that verification catches. In the Italian country report the count of self-employed contributors, in thousands, appears four pages before the amount they pay, and the two are easily transposed; against the count the divergence on that line would read in the hundreds of per cent, where against the amount it is the 93.8 per cent recorded here. Greek employer contributions are published as five components, so a comparison against any single one of them understates the published total; against the complete sum the build sits 5.7 per cent above it. A divergence quoted against the wrong comparator is indistinguishable in a table from a modelling error, which is why the basis of each line is verified and not inferred.</w:t>
       </w:r>
     </w:p>
@@ -17845,6 +17886,7 @@
         <w:rPr>
           <w:color w:val="000000" w:themeColor="text1"/>
         </w:rPr>
+        <w:lastRenderedPageBreak/>
         <w:t>way the Spanish one is not.</w:t>
       </w:r>
     </w:p>
@@ -17910,6 +17952,7 @@
         <w:rPr>
           <w:color w:val="000000" w:themeColor="text1"/>
         </w:rPr>
+        <w:lastRenderedPageBreak/>
         <w:t>records that those surfaces model no take-up rate, that their income-tax dial is the two-sided twenty-one-point grid and not the eleven-point one-sided design, and that none of them defines a binary toggle. All three are deliberate departures from the United Kingdom design, documented in Section 2 and Section 3, and a check that noticed nothing when the four surfaces differ by design would be the weaker check.</w:t>
       </w:r>
     </w:p>
@@ -17998,6 +18041,7 @@
         <w:rPr>
           <w:color w:val="000000" w:themeColor="text1"/>
         </w:rPr>
+        <w:lastRenderedPageBreak/>
         <w:t>consistent within a surface and is not a like-for-like quantity across the two bases. In the poverty layer the United Kingdom headcount of 9,001.9 thousand people is 19.5 per cent of the 46,068.2 thousand the surface covers, and that population is the people in working-age benefit units; the figure is therefore not an all-ages national at-risk-of-poverty rate, and it does not measure the same thing as the three European counts, which carry no age filter.</w:t>
       </w:r>
     </w:p>
@@ -18076,6 +18120,7 @@
         <w:rPr>
           <w:color w:val="000000" w:themeColor="text1"/>
         </w:rPr>
+        <w:lastRenderedPageBreak/>
         <w:t>size of the loss varies; across a tenfold change in magnitude Spain runs from 74.4 to 75.0 per cent, Italy from 67.0 to 68.0, and Greece from 61.8 to 61.5. At a five per cent magnitude the shares are 1.5 per cent in the United Kingdom against 74.7 in Spain, 67.9 in Italy, and 61.5 in Greece.</w:t>
       </w:r>
     </w:p>
@@ -18141,7 +18186,21 @@
         <w:rPr>
           <w:color w:val="000000" w:themeColor="text1"/>
         </w:rPr>
-        <w:t>Lastly, two instruments carry reading instructions of their own. The Spanish child-allowance dial holds no per-child amount on the surface, so its effects are anchored to the aggregates the surface records; it should be read as a proportional movement in the instrument, and a reader who takes it for a costed change in an amount per child will misread it. The Spanish minimum-income dial carries an instruction about who receives, and not about how much. For the reasons Section 8 sets out, its cost at every point is anchored to recorded national expenditure and is reliable on that account, while its decile profile records how that cost falls across a recipient set drawn at random within the eligible pool. No equivalent instruction attaches to the Italian or Greek minimum-income dials, since neither carries a binding calibration and neither performs a draw.</w:t>
+        <w:t xml:space="preserve">Lastly, two instruments carry reading instructions of their own. The Spanish child-allowance dial holds no per-child amount on the surface, so its effects are anchored to the aggregates the surface records; it should be read as a proportional movement in the instrument, and a reader who takes it for a costed change in an amount per child will misread it. The Spanish minimum-income dial carries an instruction about who receives, and not about how much. For the reasons Section 8 sets out, its cost at every point is anchored to recorded national expenditure and is reliable on that account, </w:t>
+      </w:r>
+    </w:p>
+    <w:p>
+      <w:pPr>
+        <w:rPr>
+          <w:color w:val="000000" w:themeColor="text1"/>
+        </w:rPr>
+      </w:pPr>
+      <w:r>
+        <w:rPr>
+          <w:color w:val="000000" w:themeColor="text1"/>
+        </w:rPr>
+        <w:lastRenderedPageBreak/>
+        <w:t>while its decile profile records how that cost falls across a recipient set drawn at random within the eligible pool. No equivalent instruction attaches to the Italian or Greek minimum-income dials, since neither carries a binding calibration and neither performs a draw.</w:t>
       </w:r>
     </w:p>
     <w:p>
@@ -18217,6 +18276,7 @@
         <w:rPr>
           <w:color w:val="000000" w:themeColor="text1"/>
         </w:rPr>
+        <w:lastRenderedPageBreak/>
         <w:t>The clearest case is Italian income tax, where the model returns €255,243m against a published €200,784m. The source of the difference is understood and quantified. Three national imputations cannot be represented in the public database: the compliance adjustment, the selector for the flat-tax regime, and the selectors for expense-based tax credits. Evaluated at their upper bounds those three account for 99.5 per cent of the gap, and evaluated at the recorded Italian participation in the flat-tax regime and the recorded value of the reliefs they account for about 70 per cent. What follows for a user of the tool is bounded and is stated on the dial itself. Since no self-employed individual is assigned to the flat-tax regime in the current build, the Italian tax dial appears to overstate its own effect by 12 to 13 per cent at the statutory bound and by about 3 per cent at the recorded number of taxpayers electing the regime.</w:t>
       </w:r>
     </w:p>
@@ -18252,24 +18312,19 @@
           <w:color w:val="000000" w:themeColor="text1"/>
         </w:rPr>
       </w:pPr>
-      <w:r>
-        <w:rPr>
-          <w:color w:val="000000" w:themeColor="text1"/>
-        </w:rPr>
-        <w:t xml:space="preserve">In the valuation layer every multiplier is now classified on the evidence behind it, and one effect share remains unsourced. The proportion of a housing and homelessness caseload that sustains a tenancy or exits homelessness is entered as an explicit assumption in all four tools. The published rates the evidence review identified measure tenancy sustainment after placement, on a denominator of people already housed, and no identified source supplies the referral-to-placement conversion that would give the </w:t>
-      </w:r>
-    </w:p>
-    <w:p>
-      <w:pPr>
-        <w:rPr>
-          <w:color w:val="000000" w:themeColor="text1"/>
-        </w:rPr>
-      </w:pPr>
-      <w:r>
-        <w:rPr>
-          <w:color w:val="000000" w:themeColor="text1"/>
-        </w:rPr>
-        <w:t>corresponding rate for a full caseload. The attribution applied alongside it is sourced, though transferred across intervention types, coming from randomised trials of an intensive Housing First model for people with severe mental illness where the row values generic housing support. Both qualifications are stated on the cell.</w:t>
+    </w:p>
+    <w:p>
+      <w:pPr>
+        <w:rPr>
+          <w:color w:val="000000" w:themeColor="text1"/>
+        </w:rPr>
+      </w:pPr>
+      <w:r>
+        <w:rPr>
+          <w:color w:val="000000" w:themeColor="text1"/>
+        </w:rPr>
+        <w:lastRenderedPageBreak/>
+        <w:t>In the valuation layer every multiplier is now classified on the evidence behind it, and one effect share remains unsourced. The proportion of a housing and homelessness caseload that sustains a tenancy or exits homelessness is entered as an explicit assumption in all four tools. The published rates the evidence review identified measure tenancy sustainment after placement, on a denominator of people already housed, and no identified source supplies the referral-to-placement conversion that would give the corresponding rate for a full caseload. The attribution applied alongside it is sourced, though transferred across intervention types, coming from randomised trials of an intensive Housing First model for people with severe mental illness where the row values generic housing support. Both qualifications are stated on the cell.</w:t>
       </w:r>
     </w:p>
     <w:p>
@@ -18347,7 +18402,21 @@
         <w:rPr>
           <w:color w:val="000000" w:themeColor="text1"/>
         </w:rPr>
-        <w:t>The national input datasets are the development that bears on most of the foregoing, and the variables they would supply are specific and documented. They include the Italian labour-contract class and cadastral values, the Italian compliance and flat-tax selectors, Greek property values and the Greek regional code, and a labour-market variable unpopulated in all three countries. The Joint Research Centre's inventory lists national input datasets for Spain, Italy, and Greece. Access requires an amendment to the Research Project Proposal explicitly covering EUROMOD input data and the use of household-budget-survey data, followed by a request to the Centre, and that application is in progress. Late autumn is the current working assumption for receipt, subject to approval and release by the data provider. Once available these inputs are expected to address the Italian income-tax discrepancy, the Italian and Greek minimum-income means tests, the Spanish asset derivation, and the Greek regional assignment, with no change to the modelling method.</w:t>
+        <w:t xml:space="preserve">The national input datasets are the development that bears on most of the foregoing, and the variables they would supply are specific and documented. They include the Italian labour-contract class and cadastral values, the Italian compliance and flat-tax selectors, Greek property values and the Greek regional code, and a labour-market variable unpopulated in all three countries. The Joint Research Centre's inventory lists national input datasets for Spain, Italy, and Greece. Access requires an amendment to the Research Project Proposal explicitly covering EUROMOD input data and the use of </w:t>
+      </w:r>
+    </w:p>
+    <w:p>
+      <w:pPr>
+        <w:rPr>
+          <w:color w:val="000000" w:themeColor="text1"/>
+        </w:rPr>
+      </w:pPr>
+      <w:r>
+        <w:rPr>
+          <w:color w:val="000000" w:themeColor="text1"/>
+        </w:rPr>
+        <w:lastRenderedPageBreak/>
+        <w:t>household-budget-survey data, followed by a request to the Centre, and that application is in progress. Late autumn is the current working assumption for receipt, subject to approval and release by the data provider. Once available these inputs are expected to address the Italian income-tax discrepancy, the Italian and Greek minimum-income means tests, the Spanish asset derivation, and the Greek regional assignment, with no change to the modelling method.</w:t>
       </w:r>
     </w:p>
     <w:p>
@@ -18433,6 +18502,7 @@
       </w:pPr>
       <w:bookmarkStart w:id="21" w:name="_Toc238809471"/>
       <w:r>
+        <w:lastRenderedPageBreak/>
         <w:t>Appendices</w:t>
       </w:r>
       <w:bookmarkEnd w:id="21"/>
@@ -19429,6 +19499,7 @@
               <w:rPr>
                 <w:color w:val="000000" w:themeColor="text1"/>
               </w:rPr>
+              <w:lastRenderedPageBreak/>
               <w:t>Spain</w:t>
             </w:r>
           </w:p>
@@ -20960,6 +21031,7 @@
               <w:rPr>
                 <w:color w:val="000000" w:themeColor="text1"/>
               </w:rPr>
+              <w:lastRenderedPageBreak/>
               <w:t>Domestic abuse / GBV</w:t>
             </w:r>
           </w:p>
@@ -22204,7 +22276,14 @@
         <w:rPr>
           <w:color w:val="000000" w:themeColor="text1"/>
         </w:rPr>
-        <w:t xml:space="preserve">Three groups are classified separately, and the difference matters when reading the display marks. The services layer classifies five fields on each service record, being the unit cost, the staffing ratio, and the three demand elasticities. The outcomes layer classifies one key per service, covering the valuation chain that produces the value added. A third and smaller group carries the shock interpolation together with three panel-level values, the wellbeing spine, the targeting profiles, and the national scale factor. The shock interpolation is four fields in each European block and six in the United Kingdom, the two additional ones being the poverty response to an unemployment shock, which is modelled behaviour of the British benefit system and is deliberately not carried across. Table </w:t>
+        <w:t xml:space="preserve">Three groups are classified separately, and the difference matters when reading the display marks. The services layer classifies five fields on each service record, being the unit cost, the staffing ratio, and the three demand elasticities. The outcomes layer classifies one key per service, covering the valuation chain that produces the value added. A third and smaller group carries the shock interpolation together with three panel-level values, the wellbeing spine, the targeting profiles, and the national scale </w:t>
+      </w:r>
+      <w:r>
+        <w:rPr>
+          <w:color w:val="000000" w:themeColor="text1"/>
+        </w:rPr>
+        <w:lastRenderedPageBreak/>
+        <w:t xml:space="preserve">factor. The shock interpolation is four fields in each European block and six in the United Kingdom, the two additional ones being the poverty response to an unemployment shock, which is modelled behaviour of the British benefit system and is deliberately not carried across. Table </w:t>
       </w:r>
       <w:r>
         <w:rPr>
@@ -23219,6 +23298,7 @@
       </w:pPr>
       <w:bookmarkStart w:id="27" w:name="_Toc238809475"/>
       <w:r>
+        <w:lastRenderedPageBreak/>
         <w:t>A.3 Value added per person helped</w:t>
       </w:r>
       <w:bookmarkEnd w:id="27"/>
@@ -24659,6 +24739,7 @@
                 <w:sz w:val="22"/>
                 <w:szCs w:val="22"/>
               </w:rPr>
+              <w:lastRenderedPageBreak/>
               <w:t>Drug and alcohol</w:t>
             </w:r>
           </w:p>
@@ -27556,6 +27637,7 @@
         <w:rPr>
           <w:color w:val="000000" w:themeColor="text1"/>
         </w:rPr>
+        <w:lastRenderedPageBreak/>
         <w:t>Five European rows are valued at zero at all three points and are omitted above for brevity: minimum-income casework, food aid, talking therapies, GP consultation, and opioid substitution or the drug service. Each is present in every European block with its route and its reason recorded, as Section A.7 sets out.</w:t>
       </w:r>
     </w:p>
@@ -27879,7 +27961,14 @@
               <w:rPr>
                 <w:color w:val="000000" w:themeColor="text1"/>
               </w:rPr>
-              <w:t>Effect is an outcome rate, sourced: recovery among referrals at clinical caseness who finish a course. Attribution is an impact, bracketed: 0.455 from the closest institutional analogue, 0.610 against waitlist, 0.585 against care as usual; the central is a choice within the bracket</w:t>
+              <w:t xml:space="preserve">Effect is an outcome rate, sourced: recovery among referrals at clinical caseness who finish a course. Attribution is an impact, bracketed: 0.455 from the closest institutional analogue, 0.610 against waitlist, 0.585 against care as </w:t>
+            </w:r>
+            <w:r>
+              <w:rPr>
+                <w:color w:val="000000" w:themeColor="text1"/>
+              </w:rPr>
+              <w:lastRenderedPageBreak/>
+              <w:t>usual; the central is a choice within the bracket</w:t>
             </w:r>
           </w:p>
         </w:tc>
@@ -27900,6 +27989,7 @@
               <w:rPr>
                 <w:color w:val="000000" w:themeColor="text1"/>
               </w:rPr>
+              <w:lastRenderedPageBreak/>
               <w:t>Housing / homelessness</w:t>
             </w:r>
           </w:p>
@@ -28191,7 +28281,14 @@
               <w:rPr>
                 <w:color w:val="000000" w:themeColor="text1"/>
               </w:rPr>
-              <w:t>The central rests on a null randomised result [36], an impact, so it takes one. The high is a self-reported outcome rate [30] and takes the framework's stated default, which is the only place that default now governs</w:t>
+              <w:t xml:space="preserve">The central rests on a null randomised result [36], an impact, so it takes one. The high is a self-reported outcome rate [30] and </w:t>
+            </w:r>
+            <w:r>
+              <w:rPr>
+                <w:color w:val="000000" w:themeColor="text1"/>
+              </w:rPr>
+              <w:lastRenderedPageBreak/>
+              <w:t>takes the framework's stated default, which is the only place that default now governs</w:t>
             </w:r>
           </w:p>
         </w:tc>
@@ -28212,6 +28309,7 @@
               <w:rPr>
                 <w:color w:val="000000" w:themeColor="text1"/>
               </w:rPr>
+              <w:lastRenderedPageBreak/>
               <w:t>Drug and alcohol</w:t>
             </w:r>
           </w:p>
@@ -28281,6 +28379,7 @@
       </w:pPr>
       <w:bookmarkStart w:id="31" w:name="_Toc238809477"/>
       <w:r>
+        <w:lastRenderedPageBreak/>
         <w:t>A.5 The three British sourced unit costs in full</w:t>
       </w:r>
       <w:bookmarkEnd w:id="31"/>
@@ -28940,7 +29039,14 @@
               <w:rPr>
                 <w:color w:val="000000" w:themeColor="text1"/>
               </w:rPr>
-              <w:t>European Commission study, DOI 10.2838/790594</w:t>
+              <w:t xml:space="preserve">European Commission study, </w:t>
+            </w:r>
+            <w:r>
+              <w:rPr>
+                <w:color w:val="000000" w:themeColor="text1"/>
+              </w:rPr>
+              <w:lastRenderedPageBreak/>
+              <w:t>DOI 10.2838/790594</w:t>
             </w:r>
           </w:p>
         </w:tc>
@@ -28961,6 +29067,7 @@
               <w:rPr>
                 <w:color w:val="000000" w:themeColor="text1"/>
               </w:rPr>
+              <w:lastRenderedPageBreak/>
               <w:t>Cases per employment work coach</w:t>
             </w:r>
           </w:p>
@@ -29391,6 +29498,7 @@
       </w:pPr>
       <w:bookmarkStart w:id="36" w:name="_Toc238809503"/>
       <w:r>
+        <w:lastRenderedPageBreak/>
         <w:t xml:space="preserve">Table </w:t>
       </w:r>
       <w:fldSimple w:instr=" SEQ Table \* ARABIC ">
@@ -31367,6 +31475,7 @@
         <w:rPr>
           <w:color w:val="000000" w:themeColor="text1"/>
         </w:rPr>
+        <w:lastRenderedPageBreak/>
         <w:t>computed answer. The minimum-income reduction asks a magnitude the grid does not span at all, that dial running upward from the baseline only.</w:t>
       </w:r>
     </w:p>
@@ -31427,11 +31536,15 @@
             <w:pPr>
               <w:spacing w:line="278" w:lineRule="auto"/>
               <w:rPr>
-                <w:color w:val="000000" w:themeColor="text1"/>
-              </w:rPr>
-            </w:pPr>
-            <w:r>
-              <w:rPr>
+                <w:b/>
+                <w:bCs/>
+                <w:color w:val="000000" w:themeColor="text1"/>
+              </w:rPr>
+            </w:pPr>
+            <w:r>
+              <w:rPr>
+                <w:b/>
+                <w:bCs/>
                 <w:color w:val="000000" w:themeColor="text1"/>
               </w:rPr>
               <w:t>Scenario</w:t>
@@ -31447,11 +31560,15 @@
             <w:pPr>
               <w:spacing w:line="278" w:lineRule="auto"/>
               <w:rPr>
-                <w:color w:val="000000" w:themeColor="text1"/>
-              </w:rPr>
-            </w:pPr>
-            <w:r>
-              <w:rPr>
+                <w:b/>
+                <w:bCs/>
+                <w:color w:val="000000" w:themeColor="text1"/>
+              </w:rPr>
+            </w:pPr>
+            <w:r>
+              <w:rPr>
+                <w:b/>
+                <w:bCs/>
                 <w:color w:val="000000" w:themeColor="text1"/>
               </w:rPr>
               <w:t>Built on</w:t>
@@ -31467,11 +31584,15 @@
             <w:pPr>
               <w:spacing w:line="278" w:lineRule="auto"/>
               <w:rPr>
-                <w:color w:val="000000" w:themeColor="text1"/>
-              </w:rPr>
-            </w:pPr>
-            <w:r>
-              <w:rPr>
+                <w:b/>
+                <w:bCs/>
+                <w:color w:val="000000" w:themeColor="text1"/>
+              </w:rPr>
+            </w:pPr>
+            <w:r>
+              <w:rPr>
+                <w:b/>
+                <w:bCs/>
                 <w:color w:val="000000" w:themeColor="text1"/>
               </w:rPr>
               <w:t>Magnitude</w:t>
@@ -32493,6 +32614,7 @@
       </w:pPr>
       <w:bookmarkStart w:id="43" w:name="_Toc238809506"/>
       <w:r>
+        <w:lastRenderedPageBreak/>
         <w:t xml:space="preserve">Table </w:t>
       </w:r>
       <w:fldSimple w:instr=" SEQ Table \* ARABIC ">
@@ -34659,7 +34781,14 @@
         <w:rPr>
           <w:color w:val="000000" w:themeColor="text1"/>
         </w:rPr>
-        <w:t>Away from zero the two legs move in opposite directions, and that divergence is the substantive result. The minimum-income leg rises with inequality aversion in all three countries, reaching between 2.5 and 2.7 times its cost at strong aversion, because the money reaches households whose income the weighting values most highly. The tax leg falls, to between 0.71 and 0.95 of its cost, because a first-bracket rate cut reaches taxpayers and not the poorest households. Any conclusion about which package is better therefore rests on a value judgement and not on the modelling, which is precisely what the measure is built to expose.</w:t>
+        <w:t xml:space="preserve">Away from zero the two legs move in opposite directions, and that divergence is the substantive result. The minimum-income leg rises with inequality aversion in all three countries, reaching between 2.5 and 2.7 times its cost at strong aversion, because the money reaches households whose income the weighting values most highly. The tax leg </w:t>
+      </w:r>
+      <w:r>
+        <w:rPr>
+          <w:color w:val="000000" w:themeColor="text1"/>
+        </w:rPr>
+        <w:lastRenderedPageBreak/>
+        <w:t>falls, to between 0.71 and 0.95 of its cost, because a first-bracket rate cut reaches taxpayers and not the poorest households. Any conclusion about which package is better therefore rests on a value judgement and not on the modelling, which is precisely what the measure is built to expose.</w:t>
       </w:r>
     </w:p>
     <w:p>
@@ -34784,6 +34913,7 @@
       </w:pPr>
       <w:bookmarkStart w:id="46" w:name="_Toc238809507"/>
       <w:r>
+        <w:lastRenderedPageBreak/>
         <w:t xml:space="preserve">Table </w:t>
       </w:r>
       <w:fldSimple w:instr=" SEQ Table \* ARABIC ">
@@ -36446,7 +36576,14 @@
         <w:rPr>
           <w:color w:val="000000" w:themeColor="text1"/>
         </w:rPr>
-        <w:t>The largest difference the choice of source makes is 0.86 per cent, in Italy. Set that against the uncertainty the spine itself carries. Its value of record is the central point of a published range, so the spine is bounded at about plus or minus 23 per cent, which is roughly €10,800 to €17,300 in Spain, €11,500 to €18,400 in Italy, and €10,200 to €16,400 in Greece. The widest difference the normaliser choice produces is therefore some twenty-seven times narrower than the band the underlying valuation already carries.</w:t>
+        <w:t xml:space="preserve">The largest difference the choice of source makes is 0.86 per cent, in Italy. Set that against the uncertainty the spine itself carries. Its value of record is the central point of a published range, so the spine is bounded at about plus or minus 23 per cent, which is </w:t>
+      </w:r>
+      <w:r>
+        <w:rPr>
+          <w:color w:val="000000" w:themeColor="text1"/>
+        </w:rPr>
+        <w:lastRenderedPageBreak/>
+        <w:t>roughly €10,800 to €17,300 in Spain, €11,500 to €18,400 in Italy, and €10,200 to €16,400 in Greece. The widest difference the normaliser choice produces is therefore some twenty-seven times narrower than the band the underlying valuation already carries.</w:t>
       </w:r>
     </w:p>
     <w:p>
@@ -36544,7 +36681,14 @@
         <w:rPr>
           <w:color w:val="000000" w:themeColor="text1"/>
         </w:rPr>
-        <w:t>What a clean clone cannot do is rebuild a response surface, and that boundary falls where the licensed inputs do. Rebuilding the United Kingdom surface requires the Family Resources Survey 2023-24, study number 9367, under end-user licence from the UK Data Service, with PolicyEngine UK at the pinned release; rebuilding any European surface requires the EU-SILC scientific-use files of the 2024 wave, 2025 release, under research contract with Eurostat, with EUROMOD at model release J2.0+ and software version 3.8.6 and the national model files for the country. A licence holder needs nothing further from the project. Two constraints attach to the rebuild alone, using and verifying being platform-neutral: the rebuild paths are written for Windows and have not been generalised, and the European build refuses to proceed unless the engine assembly it loads sits in the expected installation directory, since the engine bundled with the connector fails outright on the Italian and Spanish systems.</w:t>
+        <w:t xml:space="preserve">What a clean clone cannot do is rebuild a response surface, and that boundary falls where the licensed inputs do. Rebuilding the United Kingdom surface requires the Family Resources Survey 2023-24, study number 9367, under end-user licence from the UK Data Service, with PolicyEngine UK at the pinned release; rebuilding any European surface requires the EU-SILC scientific-use files of the 2024 wave, 2025 release, under research contract with Eurostat, with EUROMOD at model release J2.0+ and software version 3.8.6 and the national model files for the country. A licence holder needs </w:t>
+      </w:r>
+      <w:r>
+        <w:rPr>
+          <w:color w:val="000000" w:themeColor="text1"/>
+        </w:rPr>
+        <w:lastRenderedPageBreak/>
+        <w:t>nothing further from the project. Two constraints attach to the rebuild alone, using and verifying being platform-neutral: the rebuild paths are written for Windows and have not been generalised, and the European build refuses to proceed unless the engine assembly it loads sits in the expected installation directory, since the engine bundled with the connector fails outright on the Italian and Spanish systems.</w:t>
       </w:r>
     </w:p>
     <w:p>
@@ -36642,6 +36786,7 @@
         <w:rPr>
           <w:color w:val="000000" w:themeColor="text1"/>
         </w:rPr>
+        <w:lastRenderedPageBreak/>
         <w:t>Two parts of the tree carry the licence of the engine they call, because they call it directly. The United Kingdom build files importing PolicyEngine are published under the GNU Affero General Public License version 3, and the European build files importing the EUROMOD connector under the European Union Public Licence version 1.2, each being the engine's own licence. Both sets are rebuild-path code and neither is reachable from using or verifying the deliverable, so a reader who never rebuilds a surface never encounters either, and in practice the reciprocity costs nothing, since anyone able to run those files must already hold and be bound by the engine they call. Each file records the licence applying to it and a licence file sits in each directory.</w:t>
       </w:r>
     </w:p>
@@ -36677,6 +36822,7 @@
       </w:pPr>
       <w:bookmarkStart w:id="55" w:name="_Toc238809492"/>
       <w:r>
+        <w:lastRenderedPageBreak/>
         <w:t>Bibliography</w:t>
       </w:r>
       <w:bookmarkEnd w:id="55"/>
@@ -36854,12 +37000,14 @@
         <w:ind w:left="504" w:hanging="504"/>
         <w:rPr>
           <w:color w:val="000000" w:themeColor="text1"/>
-        </w:rPr>
-      </w:pPr>
-      <w:r>
-        <w:rPr>
-          <w:color w:val="000000" w:themeColor="text1"/>
-        </w:rPr>
+          <w:lang w:val="it-IT"/>
+        </w:rPr>
+      </w:pPr>
+      <w:r>
+        <w:rPr>
+          <w:color w:val="000000" w:themeColor="text1"/>
+        </w:rPr>
+        <w:lastRenderedPageBreak/>
         <w:t xml:space="preserve">[13]  European Commission, Eurostat. Labour cost levels by NACE rev. 2 activity. </w:t>
       </w:r>
       <w:r>
@@ -37035,7 +37183,7 @@
         <w:rPr>
           <w:color w:val="000000" w:themeColor="text1"/>
         </w:rPr>
-        <w:t>[24]  HM Treasury. GDP deflators at market prices, and money GDP: December 2025 (quarterly national accounts). ONS financial-year series L8GG, 2026. Published January 2026. The March 2026 Quarterly National Accounts release is used for the unit-cost layer.</w:t>
+        <w:t xml:space="preserve">[24]  HM Treasury. GDP deflators at market prices, and money GDP: December 2025 </w:t>
       </w:r>
     </w:p>
     <w:p>
@@ -37049,6 +37197,27 @@
         <w:rPr>
           <w:color w:val="000000" w:themeColor="text1"/>
         </w:rPr>
+        <w:lastRenderedPageBreak/>
+        <w:t xml:space="preserve">          </w:t>
+      </w:r>
+      <w:r>
+        <w:rPr>
+          <w:color w:val="000000" w:themeColor="text1"/>
+        </w:rPr>
+        <w:t>(quarterly national accounts). ONS financial-year series L8GG, 2026. Published January 2026. The March 2026 Quarterly National Accounts release is used for the unit-cost layer.</w:t>
+      </w:r>
+    </w:p>
+    <w:p>
+      <w:pPr>
+        <w:ind w:left="504" w:hanging="504"/>
+        <w:rPr>
+          <w:color w:val="000000" w:themeColor="text1"/>
+        </w:rPr>
+      </w:pPr>
+      <w:r>
+        <w:rPr>
+          <w:color w:val="000000" w:themeColor="text1"/>
+        </w:rPr>
         <w:t>[25]  HM Treasury. The green book: UK government guidance on appraisal. Technical report, HM Treasury, London, 2026. February 2026. ISBN 978-1-918417-12-8; PU3608. Supersedes the 2022 edition.</w:t>
       </w:r>
     </w:p>
@@ -37189,6 +37358,7 @@
         <w:rPr>
           <w:color w:val="000000" w:themeColor="text1"/>
         </w:rPr>
+        <w:lastRenderedPageBreak/>
         <w:t>[35]  Rhys Oliver, Barnaby Alexander, Stephen Roe, and Miriam Wlasny. The economic and social costs of domestic abuse. Research Report 107, Home Office, London, 2019.</w:t>
       </w:r>
     </w:p>

</xml_diff>